<commit_message>
[Frontend] Implementar formulario de venta de producto y venta adicional ligada a un servicio. [Backend] Crear endpoint de venta de producto con actualización automática de stock. [Frontend] Construir pantalla Mis Ventas con filtros por fecha, tipo y totales del empleado. [Backend] Crear endpoints para consultar ventas del empleado autenticado y detalle de comisiones.
</commit_message>
<xml_diff>
--- a/ITINERARIO_PROYECTO_REACT_NODEJS_COMPLETO.docx
+++ b/ITINERARIO_PROYECTO_REACT_NODEJS_COMPLETO.docx
@@ -1746,6 +1746,7 @@
             <w:pPr>
               <w:spacing w:after="40"/>
               <w:rPr>
+                <w:highlight w:val="yellow"/>
                 <w:lang w:val="es-MX"/>
               </w:rPr>
             </w:pPr>
@@ -1755,6 +1756,7 @@
                 <w:b/>
                 <w:color w:val="1F4E79"/>
                 <w:sz w:val="15"/>
+                <w:highlight w:val="yellow"/>
                 <w:lang w:val="es-MX"/>
               </w:rPr>
               <w:t>[</w:t>
@@ -1766,6 +1768,7 @@
                 <w:b/>
                 <w:color w:val="1F4E79"/>
                 <w:sz w:val="15"/>
+                <w:highlight w:val="yellow"/>
                 <w:lang w:val="es-MX"/>
               </w:rPr>
               <w:t>Frontend</w:t>
@@ -1777,6 +1780,7 @@
                 <w:b/>
                 <w:color w:val="1F4E79"/>
                 <w:sz w:val="15"/>
+                <w:highlight w:val="yellow"/>
                 <w:lang w:val="es-MX"/>
               </w:rPr>
               <w:t xml:space="preserve">] </w:t>
@@ -1785,6 +1789,7 @@
               <w:rPr>
                 <w:rFonts w:ascii="Aptos" w:eastAsia="Aptos" w:hAnsi="Aptos"/>
                 <w:sz w:val="15"/>
+                <w:highlight w:val="yellow"/>
                 <w:lang w:val="es-MX"/>
               </w:rPr>
               <w:t xml:space="preserve">Crear </w:t>
@@ -1794,6 +1799,7 @@
               <w:rPr>
                 <w:rFonts w:ascii="Aptos" w:eastAsia="Aptos" w:hAnsi="Aptos"/>
                 <w:sz w:val="15"/>
+                <w:highlight w:val="yellow"/>
                 <w:lang w:val="es-MX"/>
               </w:rPr>
               <w:t>hooks</w:t>
@@ -1803,6 +1809,7 @@
               <w:rPr>
                 <w:rFonts w:ascii="Aptos" w:eastAsia="Aptos" w:hAnsi="Aptos"/>
                 <w:sz w:val="15"/>
+                <w:highlight w:val="yellow"/>
                 <w:lang w:val="es-MX"/>
               </w:rPr>
               <w:t>/servicios para consumir API de clientes, empleados y perfil.</w:t>
@@ -1812,6 +1819,7 @@
             <w:pPr>
               <w:spacing w:after="40"/>
               <w:rPr>
+                <w:highlight w:val="yellow"/>
                 <w:lang w:val="es-MX"/>
               </w:rPr>
             </w:pPr>
@@ -1821,6 +1829,7 @@
                 <w:b/>
                 <w:color w:val="1F4E79"/>
                 <w:sz w:val="15"/>
+                <w:highlight w:val="yellow"/>
                 <w:lang w:val="es-MX"/>
               </w:rPr>
               <w:t>[</w:t>
@@ -1832,6 +1841,7 @@
                 <w:b/>
                 <w:color w:val="1F4E79"/>
                 <w:sz w:val="15"/>
+                <w:highlight w:val="yellow"/>
                 <w:lang w:val="es-MX"/>
               </w:rPr>
               <w:t>Backend</w:t>
@@ -1843,6 +1853,7 @@
                 <w:b/>
                 <w:color w:val="1F4E79"/>
                 <w:sz w:val="15"/>
+                <w:highlight w:val="yellow"/>
                 <w:lang w:val="es-MX"/>
               </w:rPr>
               <w:t xml:space="preserve">] </w:t>
@@ -1851,6 +1862,7 @@
               <w:rPr>
                 <w:rFonts w:ascii="Aptos" w:eastAsia="Aptos" w:hAnsi="Aptos"/>
                 <w:sz w:val="15"/>
+                <w:highlight w:val="yellow"/>
                 <w:lang w:val="es-MX"/>
               </w:rPr>
               <w:t>Implementar autenticación, middleware de roles y protección de rutas administrativas.</w:t>
@@ -2201,6 +2213,7 @@
             <w:pPr>
               <w:spacing w:after="40"/>
               <w:rPr>
+                <w:highlight w:val="yellow"/>
                 <w:lang w:val="es-MX"/>
               </w:rPr>
             </w:pPr>
@@ -2210,6 +2223,7 @@
                 <w:b/>
                 <w:color w:val="1F4E79"/>
                 <w:sz w:val="15"/>
+                <w:highlight w:val="yellow"/>
                 <w:lang w:val="es-MX"/>
               </w:rPr>
               <w:t>[</w:t>
@@ -2221,6 +2235,7 @@
                 <w:b/>
                 <w:color w:val="1F4E79"/>
                 <w:sz w:val="15"/>
+                <w:highlight w:val="yellow"/>
                 <w:lang w:val="es-MX"/>
               </w:rPr>
               <w:t>Frontend</w:t>
@@ -2232,6 +2247,7 @@
                 <w:b/>
                 <w:color w:val="1F4E79"/>
                 <w:sz w:val="15"/>
+                <w:highlight w:val="yellow"/>
                 <w:lang w:val="es-MX"/>
               </w:rPr>
               <w:t xml:space="preserve">] </w:t>
@@ -2240,6 +2256,7 @@
               <w:rPr>
                 <w:rFonts w:ascii="Aptos" w:eastAsia="Aptos" w:hAnsi="Aptos"/>
                 <w:sz w:val="15"/>
+                <w:highlight w:val="yellow"/>
                 <w:lang w:val="es-MX"/>
               </w:rPr>
               <w:t>Implementar formulario de venta de servicio con cliente, empleado, servicio y metodo de pago.</w:t>
@@ -2249,6 +2266,7 @@
             <w:pPr>
               <w:spacing w:after="40"/>
               <w:rPr>
+                <w:highlight w:val="yellow"/>
                 <w:lang w:val="es-MX"/>
               </w:rPr>
             </w:pPr>
@@ -2258,6 +2276,7 @@
                 <w:b/>
                 <w:color w:val="1F4E79"/>
                 <w:sz w:val="15"/>
+                <w:highlight w:val="yellow"/>
                 <w:lang w:val="es-MX"/>
               </w:rPr>
               <w:t>[</w:t>
@@ -2269,6 +2288,7 @@
                 <w:b/>
                 <w:color w:val="1F4E79"/>
                 <w:sz w:val="15"/>
+                <w:highlight w:val="yellow"/>
                 <w:lang w:val="es-MX"/>
               </w:rPr>
               <w:t>Backend</w:t>
@@ -2280,6 +2300,7 @@
                 <w:b/>
                 <w:color w:val="1F4E79"/>
                 <w:sz w:val="15"/>
+                <w:highlight w:val="yellow"/>
                 <w:lang w:val="es-MX"/>
               </w:rPr>
               <w:t xml:space="preserve">] </w:t>
@@ -2288,6 +2309,7 @@
               <w:rPr>
                 <w:rFonts w:ascii="Aptos" w:eastAsia="Aptos" w:hAnsi="Aptos"/>
                 <w:sz w:val="15"/>
+                <w:highlight w:val="yellow"/>
                 <w:lang w:val="es-MX"/>
               </w:rPr>
               <w:t xml:space="preserve">Crear </w:t>
@@ -2297,6 +2319,7 @@
               <w:rPr>
                 <w:rFonts w:ascii="Aptos" w:eastAsia="Aptos" w:hAnsi="Aptos"/>
                 <w:sz w:val="15"/>
+                <w:highlight w:val="yellow"/>
                 <w:lang w:val="es-MX"/>
               </w:rPr>
               <w:t>endpoint</w:t>
@@ -2306,6 +2329,7 @@
               <w:rPr>
                 <w:rFonts w:ascii="Aptos" w:eastAsia="Aptos" w:hAnsi="Aptos"/>
                 <w:sz w:val="15"/>
+                <w:highlight w:val="yellow"/>
                 <w:lang w:val="es-MX"/>
               </w:rPr>
               <w:t xml:space="preserve"> transaccional para registrar servicio, venta, visita y comisión.</w:t>
@@ -2583,6 +2607,7 @@
             <w:pPr>
               <w:spacing w:after="40"/>
               <w:rPr>
+                <w:highlight w:val="yellow"/>
                 <w:lang w:val="es-MX"/>
               </w:rPr>
             </w:pPr>
@@ -2592,6 +2617,7 @@
                 <w:b/>
                 <w:color w:val="1F4E79"/>
                 <w:sz w:val="15"/>
+                <w:highlight w:val="yellow"/>
                 <w:lang w:val="es-MX"/>
               </w:rPr>
               <w:t>[</w:t>
@@ -2603,6 +2629,7 @@
                 <w:b/>
                 <w:color w:val="1F4E79"/>
                 <w:sz w:val="15"/>
+                <w:highlight w:val="yellow"/>
                 <w:lang w:val="es-MX"/>
               </w:rPr>
               <w:t>Frontend</w:t>
@@ -2614,6 +2641,7 @@
                 <w:b/>
                 <w:color w:val="1F4E79"/>
                 <w:sz w:val="15"/>
+                <w:highlight w:val="yellow"/>
                 <w:lang w:val="es-MX"/>
               </w:rPr>
               <w:t xml:space="preserve">] </w:t>
@@ -2622,6 +2650,7 @@
               <w:rPr>
                 <w:rFonts w:ascii="Aptos" w:eastAsia="Aptos" w:hAnsi="Aptos"/>
                 <w:sz w:val="15"/>
+                <w:highlight w:val="yellow"/>
                 <w:lang w:val="es-MX"/>
               </w:rPr>
               <w:t>Implementar formulario de venta de producto y venta adicional ligada a un servicio.</w:t>
@@ -2631,6 +2660,7 @@
             <w:pPr>
               <w:spacing w:after="40"/>
               <w:rPr>
+                <w:highlight w:val="yellow"/>
                 <w:lang w:val="es-MX"/>
               </w:rPr>
             </w:pPr>
@@ -2640,6 +2670,7 @@
                 <w:b/>
                 <w:color w:val="1F4E79"/>
                 <w:sz w:val="15"/>
+                <w:highlight w:val="yellow"/>
                 <w:lang w:val="es-MX"/>
               </w:rPr>
               <w:t>[</w:t>
@@ -2651,6 +2682,7 @@
                 <w:b/>
                 <w:color w:val="1F4E79"/>
                 <w:sz w:val="15"/>
+                <w:highlight w:val="yellow"/>
                 <w:lang w:val="es-MX"/>
               </w:rPr>
               <w:t>Backend</w:t>
@@ -2662,6 +2694,7 @@
                 <w:b/>
                 <w:color w:val="1F4E79"/>
                 <w:sz w:val="15"/>
+                <w:highlight w:val="yellow"/>
                 <w:lang w:val="es-MX"/>
               </w:rPr>
               <w:t xml:space="preserve">] </w:t>
@@ -2670,6 +2703,7 @@
               <w:rPr>
                 <w:rFonts w:ascii="Aptos" w:eastAsia="Aptos" w:hAnsi="Aptos"/>
                 <w:sz w:val="15"/>
+                <w:highlight w:val="yellow"/>
                 <w:lang w:val="es-MX"/>
               </w:rPr>
               <w:t xml:space="preserve">Crear </w:t>
@@ -2679,6 +2713,7 @@
               <w:rPr>
                 <w:rFonts w:ascii="Aptos" w:eastAsia="Aptos" w:hAnsi="Aptos"/>
                 <w:sz w:val="15"/>
+                <w:highlight w:val="yellow"/>
                 <w:lang w:val="es-MX"/>
               </w:rPr>
               <w:t>endpoint</w:t>
@@ -2688,6 +2723,7 @@
               <w:rPr>
                 <w:rFonts w:ascii="Aptos" w:eastAsia="Aptos" w:hAnsi="Aptos"/>
                 <w:sz w:val="15"/>
+                <w:highlight w:val="yellow"/>
                 <w:lang w:val="es-MX"/>
               </w:rPr>
               <w:t xml:space="preserve"> de venta de producto con actualización automática de stock.</w:t>

</xml_diff>

<commit_message>
especificación de la conexión de la base de datos y adición de script para crearla
</commit_message>
<xml_diff>
--- a/ITINERARIO_PROYECTO_REACT_NODEJS_COMPLETO.docx
+++ b/ITINERARIO_PROYECTO_REACT_NODEJS_COMPLETO.docx
@@ -2990,6 +2990,7 @@
             <w:pPr>
               <w:spacing w:after="40"/>
               <w:rPr>
+                <w:highlight w:val="yellow"/>
                 <w:lang w:val="es-MX"/>
               </w:rPr>
             </w:pPr>
@@ -2999,6 +3000,7 @@
                 <w:b/>
                 <w:color w:val="1F4E79"/>
                 <w:sz w:val="15"/>
+                <w:highlight w:val="yellow"/>
                 <w:lang w:val="es-MX"/>
               </w:rPr>
               <w:t>[</w:t>
@@ -3010,6 +3012,7 @@
                 <w:b/>
                 <w:color w:val="1F4E79"/>
                 <w:sz w:val="15"/>
+                <w:highlight w:val="yellow"/>
                 <w:lang w:val="es-MX"/>
               </w:rPr>
               <w:t>Frontend</w:t>
@@ -3021,6 +3024,7 @@
                 <w:b/>
                 <w:color w:val="1F4E79"/>
                 <w:sz w:val="15"/>
+                <w:highlight w:val="yellow"/>
                 <w:lang w:val="es-MX"/>
               </w:rPr>
               <w:t xml:space="preserve">] </w:t>
@@ -3029,6 +3033,7 @@
               <w:rPr>
                 <w:rFonts w:ascii="Aptos" w:eastAsia="Aptos" w:hAnsi="Aptos"/>
                 <w:sz w:val="15"/>
+                <w:highlight w:val="yellow"/>
                 <w:lang w:val="es-MX"/>
               </w:rPr>
               <w:t>Construir pantalla Mis Ventas con filtros por fecha, tipo y totales del empleado.</w:t>
@@ -3038,6 +3043,7 @@
             <w:pPr>
               <w:spacing w:after="40"/>
               <w:rPr>
+                <w:highlight w:val="yellow"/>
                 <w:lang w:val="es-MX"/>
               </w:rPr>
             </w:pPr>
@@ -3047,6 +3053,7 @@
                 <w:b/>
                 <w:color w:val="1F4E79"/>
                 <w:sz w:val="15"/>
+                <w:highlight w:val="yellow"/>
                 <w:lang w:val="es-MX"/>
               </w:rPr>
               <w:t>[</w:t>
@@ -3058,6 +3065,7 @@
                 <w:b/>
                 <w:color w:val="1F4E79"/>
                 <w:sz w:val="15"/>
+                <w:highlight w:val="yellow"/>
                 <w:lang w:val="es-MX"/>
               </w:rPr>
               <w:t>Backend</w:t>
@@ -3069,6 +3077,7 @@
                 <w:b/>
                 <w:color w:val="1F4E79"/>
                 <w:sz w:val="15"/>
+                <w:highlight w:val="yellow"/>
                 <w:lang w:val="es-MX"/>
               </w:rPr>
               <w:t xml:space="preserve">] </w:t>
@@ -3077,6 +3086,7 @@
               <w:rPr>
                 <w:rFonts w:ascii="Aptos" w:eastAsia="Aptos" w:hAnsi="Aptos"/>
                 <w:sz w:val="15"/>
+                <w:highlight w:val="yellow"/>
                 <w:lang w:val="es-MX"/>
               </w:rPr>
               <w:t xml:space="preserve">Crear </w:t>
@@ -3086,6 +3096,7 @@
               <w:rPr>
                 <w:rFonts w:ascii="Aptos" w:eastAsia="Aptos" w:hAnsi="Aptos"/>
                 <w:sz w:val="15"/>
+                <w:highlight w:val="yellow"/>
                 <w:lang w:val="es-MX"/>
               </w:rPr>
               <w:t>endpoints</w:t>
@@ -3095,6 +3106,7 @@
               <w:rPr>
                 <w:rFonts w:ascii="Aptos" w:eastAsia="Aptos" w:hAnsi="Aptos"/>
                 <w:sz w:val="15"/>
+                <w:highlight w:val="yellow"/>
                 <w:lang w:val="es-MX"/>
               </w:rPr>
               <w:t xml:space="preserve"> para consultar ventas del empleado autenticado y detalle de comisiones.</w:t>

</xml_diff>